<commit_message>
feat: enhance UI for client details, history panels, and documents
</commit_message>
<xml_diff>
--- a/public/templates/proforma_netsprint.docx
+++ b/public/templates/proforma_netsprint.docx
@@ -16,7 +16,7 @@
           <w:rFonts w:ascii="Book Antiqua" w:hAnsi="Book Antiqua" w:cstheme="minorHAnsi"/>
           <w:noProof/>
         </w:rPr>
-        <w:object w:dxaOrig="1440" w:dyaOrig="1440" w14:anchorId="378A08FD">
+        <w:object w:dxaOrig="1440" w:dyaOrig="1440" w14:anchorId="33ECBC66">
           <v:shapetype id="_x0000_t75" coordsize="21600,21600" o:spt="75" o:preferrelative="t" path="m@4@5l@4@11@9@11@9@5xe" filled="f" stroked="f">
             <v:stroke joinstyle="miter"/>
             <v:formulas>
@@ -39,7 +39,7 @@
           <v:shape id="_x0000_s1026" type="#_x0000_t75" alt="" style="position:absolute;left:0;text-align:left;margin-left:-29.45pt;margin-top:-7.5pt;width:114.9pt;height:65.05pt;z-index:251659264;mso-wrap-edited:f;mso-width-percent:0;mso-height-percent:0;mso-position-horizontal-relative:text;mso-position-vertical-relative:text;mso-width-percent:0;mso-height-percent:0" o:allowoverlap="f">
             <v:imagedata r:id="rId5" o:title=""/>
           </v:shape>
-          <o:OLEObject Type="Embed" ProgID="Unknown" ShapeID="_x0000_s1026" DrawAspect="Content" ObjectID="_1844848270" r:id="rId6"/>
+          <o:OLEObject Type="Embed" ProgID="Unknown" ShapeID="_x0000_s1026" DrawAspect="Content" ObjectID="_1845112510" r:id="rId6"/>
         </w:object>
       </w:r>
       <w:r>
@@ -563,7 +563,21 @@
                 <w:rFonts w:ascii="Book Antiqua" w:hAnsi="Book Antiqua"/>
                 <w:color w:val="000000"/>
               </w:rPr>
-              <w:t>client_adress</w:t>
+              <w:t>client_ad</w:t>
+            </w:r>
+            <w:r>
+              <w:rPr>
+                <w:rFonts w:ascii="Book Antiqua" w:hAnsi="Book Antiqua"/>
+                <w:color w:val="000000"/>
+              </w:rPr>
+              <w:t>d</w:t>
+            </w:r>
+            <w:r>
+              <w:rPr>
+                <w:rFonts w:ascii="Book Antiqua" w:hAnsi="Book Antiqua"/>
+                <w:color w:val="000000"/>
+              </w:rPr>
+              <w:t>ress</w:t>
             </w:r>
             <w:r>
               <w:rPr>
@@ -1642,7 +1656,7 @@
                 <w:sz w:val="24"/>
                 <w:szCs w:val="28"/>
               </w:rPr>
-              <w:t>ttc</w:t>
+              <w:t>ht</w:t>
             </w:r>
             <w:r>
               <w:rPr>
@@ -1768,7 +1782,19 @@
         <w:rPr>
           <w:rFonts w:ascii="Book Antiqua" w:hAnsi="Book Antiqua"/>
         </w:rPr>
-        <w:t xml:space="preserve">{prix_ttc_lettres} </w:t>
+        <w:t>{prix_</w:t>
+      </w:r>
+      <w:r>
+        <w:rPr>
+          <w:rFonts w:ascii="Book Antiqua" w:hAnsi="Book Antiqua"/>
+        </w:rPr>
+        <w:t>ht</w:t>
+      </w:r>
+      <w:r>
+        <w:rPr>
+          <w:rFonts w:ascii="Book Antiqua" w:hAnsi="Book Antiqua"/>
+        </w:rPr>
+        <w:t xml:space="preserve">_lettres} </w:t>
       </w:r>
       <w:r>
         <w:rPr>

</xml_diff>